<commit_message>
assignment 2 aseesion 2
</commit_message>
<xml_diff>
--- a/session2_Yushra.docx
+++ b/session2_Yushra.docx
@@ -4,6 +4,7 @@
   <w:body>
     <w:p>
       <w:pPr>
+        <w:ind w:firstLine="720"/>
         <w:jc w:val="center"/>
         <w:rPr>
           <w:rFonts w:ascii="Times New Roman" w:hAnsi="Times New Roman" w:cs="Times New Roman"/>
@@ -25,7 +26,19 @@
           <w:u w:val="single"/>
           <w:lang w:val="en-US"/>
         </w:rPr>
-        <w:t xml:space="preserve">Session - 1 </w:t>
+        <w:t xml:space="preserve">Session - </w:t>
+      </w:r>
+      <w:r>
+        <w:rPr>
+          <w:rFonts w:ascii="Times New Roman" w:hAnsi="Times New Roman" w:cs="Times New Roman"/>
+          <w:b/>
+          <w:bCs/>
+          <w:sz w:val="36"/>
+          <w:szCs w:val="36"/>
+          <w:u w:val="single"/>
+          <w:lang w:val="en-US"/>
+        </w:rPr>
+        <w:t>2</w:t>
       </w:r>
     </w:p>
     <w:p>

</xml_diff>